<commit_message>
add webhook handler for telegram
</commit_message>
<xml_diff>
--- a/backend/templates/leave_template.docx
+++ b/backend/templates/leave_template.docx
@@ -735,6 +735,8 @@
             <w:r>
               <w:rPr>
                 <w:color w:val="FFFFFF" w:themeColor="background1"/>
+                <w:sz w:val="22"/>
+                <w:szCs w:val="22"/>
               </w:rPr>
               <w:t>1</w:t>
             </w:r>
@@ -742,12 +744,16 @@
               <w:rPr>
                 <w:color w:val="FFFFFF" w:themeColor="background1"/>
                 <w:spacing w:val="-4"/>
+                <w:sz w:val="22"/>
+                <w:szCs w:val="22"/>
               </w:rPr>
               <w:t xml:space="preserve"> </w:t>
             </w:r>
             <w:r>
               <w:rPr>
                 <w:color w:val="FFFFFF" w:themeColor="background1"/>
+                <w:sz w:val="22"/>
+                <w:szCs w:val="22"/>
               </w:rPr>
               <w:t>day(</w:t>
             </w:r>
@@ -755,6 +761,8 @@
               <w:rPr>
                 <w:rFonts w:ascii="Consolas" w:hAnsi="Consolas"/>
                 <w:color w:val="FFFFFF" w:themeColor="background1"/>
+                <w:sz w:val="22"/>
+                <w:szCs w:val="22"/>
               </w:rPr>
               <w:t>{{</w:t>
             </w:r>
@@ -763,6 +771,8 @@
               <w:rPr>
                 <w:rFonts w:ascii="Consolas" w:hAnsi="Consolas"/>
                 <w:color w:val="FFFFFF" w:themeColor="background1"/>
+                <w:sz w:val="22"/>
+                <w:szCs w:val="22"/>
               </w:rPr>
               <w:t>date_g</w:t>
             </w:r>
@@ -771,12 +781,16 @@
               <w:rPr>
                 <w:rFonts w:ascii="Consolas" w:hAnsi="Consolas"/>
                 <w:color w:val="FFFFFF" w:themeColor="background1"/>
+                <w:sz w:val="22"/>
+                <w:szCs w:val="22"/>
               </w:rPr>
               <w:t>}}</w:t>
             </w:r>
             <w:r>
               <w:rPr>
                 <w:color w:val="FFFFFF" w:themeColor="background1"/>
+                <w:sz w:val="22"/>
+                <w:szCs w:val="22"/>
               </w:rPr>
               <w:t>)</w:t>
             </w:r>
@@ -784,12 +798,16 @@
               <w:rPr>
                 <w:color w:val="FFFFFF" w:themeColor="background1"/>
                 <w:spacing w:val="-4"/>
+                <w:sz w:val="22"/>
+                <w:szCs w:val="22"/>
               </w:rPr>
               <w:t xml:space="preserve"> </w:t>
             </w:r>
             <w:r>
               <w:rPr>
                 <w:color w:val="FFFFFF" w:themeColor="background1"/>
+                <w:sz w:val="22"/>
+                <w:szCs w:val="22"/>
               </w:rPr>
               <w:t>to</w:t>
             </w:r>
@@ -797,6 +815,8 @@
               <w:rPr>
                 <w:color w:val="FFFFFF" w:themeColor="background1"/>
                 <w:spacing w:val="-5"/>
+                <w:sz w:val="22"/>
+                <w:szCs w:val="22"/>
               </w:rPr>
               <w:t xml:space="preserve"> </w:t>
             </w:r>
@@ -804,6 +824,8 @@
               <w:rPr>
                 <w:color w:val="FFFFFF" w:themeColor="background1"/>
                 <w:spacing w:val="-5"/>
+                <w:sz w:val="22"/>
+                <w:szCs w:val="22"/>
               </w:rPr>
               <w:t>(</w:t>
             </w:r>
@@ -811,6 +833,8 @@
               <w:rPr>
                 <w:rFonts w:ascii="Consolas" w:hAnsi="Consolas"/>
                 <w:color w:val="FFFFFF" w:themeColor="background1"/>
+                <w:sz w:val="22"/>
+                <w:szCs w:val="22"/>
               </w:rPr>
               <w:t>{{</w:t>
             </w:r>
@@ -819,6 +843,8 @@
               <w:rPr>
                 <w:rFonts w:ascii="Consolas" w:hAnsi="Consolas"/>
                 <w:color w:val="FFFFFF" w:themeColor="background1"/>
+                <w:sz w:val="22"/>
+                <w:szCs w:val="22"/>
               </w:rPr>
               <w:t>date_g</w:t>
             </w:r>
@@ -827,6 +853,8 @@
               <w:rPr>
                 <w:rFonts w:ascii="Consolas" w:hAnsi="Consolas"/>
                 <w:color w:val="FFFFFF" w:themeColor="background1"/>
+                <w:sz w:val="22"/>
+                <w:szCs w:val="22"/>
               </w:rPr>
               <w:t>}}</w:t>
             </w:r>
@@ -834,6 +862,8 @@
               <w:rPr>
                 <w:color w:val="FFFFFF" w:themeColor="background1"/>
                 <w:spacing w:val="-4"/>
+                <w:sz w:val="22"/>
+                <w:szCs w:val="22"/>
               </w:rPr>
               <w:t>)</w:t>
             </w:r>
@@ -865,16 +895,16 @@
               <w:rPr>
                 <w:rFonts w:ascii="Consolas" w:hAnsi="Consolas"/>
                 <w:color w:val="FFFFFF" w:themeColor="background1"/>
-                <w:sz w:val="24"/>
-                <w:szCs w:val="24"/>
+                <w:sz w:val="28"/>
+                <w:szCs w:val="28"/>
               </w:rPr>
             </w:pPr>
             <w:r>
               <w:rPr>
                 <w:color w:val="FFFFFF" w:themeColor="background1"/>
                 <w:w w:val="97"/>
-                <w:sz w:val="24"/>
-                <w:szCs w:val="24"/>
+                <w:sz w:val="28"/>
+                <w:szCs w:val="28"/>
               </w:rPr>
               <w:t>1</w:t>
             </w:r>
@@ -882,8 +912,8 @@
               <w:rPr>
                 <w:color w:val="FFFFFF" w:themeColor="background1"/>
                 <w:spacing w:val="31"/>
-                <w:sz w:val="24"/>
-                <w:szCs w:val="24"/>
+                <w:sz w:val="28"/>
+                <w:szCs w:val="28"/>
                 <w:rtl/>
               </w:rPr>
               <w:t xml:space="preserve"> </w:t>
@@ -893,8 +923,8 @@
               <w:rPr>
                 <w:color w:val="FFFFFF" w:themeColor="background1"/>
                 <w:w w:val="97"/>
-                <w:sz w:val="24"/>
-                <w:szCs w:val="24"/>
+                <w:sz w:val="28"/>
+                <w:szCs w:val="28"/>
                 <w:rtl/>
               </w:rPr>
               <w:t>ﻳﻮﻡ</w:t>
@@ -904,8 +934,8 @@
               <w:rPr>
                 <w:color w:val="FFFFFF" w:themeColor="background1"/>
                 <w:w w:val="97"/>
-                <w:sz w:val="24"/>
-                <w:szCs w:val="24"/>
+                <w:sz w:val="28"/>
+                <w:szCs w:val="28"/>
               </w:rPr>
               <w:t>(</w:t>
             </w:r>
@@ -913,8 +943,8 @@
               <w:rPr>
                 <w:color w:val="FFFFFF" w:themeColor="background1"/>
                 <w:w w:val="97"/>
-                <w:sz w:val="24"/>
-                <w:szCs w:val="24"/>
+                <w:sz w:val="28"/>
+                <w:szCs w:val="28"/>
               </w:rPr>
               <w:t>1</w:t>
             </w:r>
@@ -922,8 +952,8 @@
               <w:rPr>
                 <w:rFonts w:ascii="Consolas" w:hAnsi="Consolas"/>
                 <w:color w:val="FFFFFF" w:themeColor="background1"/>
-                <w:sz w:val="24"/>
-                <w:szCs w:val="24"/>
+                <w:sz w:val="28"/>
+                <w:szCs w:val="28"/>
               </w:rPr>
               <w:t>{{</w:t>
             </w:r>
@@ -932,8 +962,8 @@
               <w:rPr>
                 <w:rFonts w:ascii="Consolas" w:hAnsi="Consolas"/>
                 <w:color w:val="FFFFFF" w:themeColor="background1"/>
-                <w:sz w:val="24"/>
-                <w:szCs w:val="24"/>
+                <w:sz w:val="28"/>
+                <w:szCs w:val="28"/>
               </w:rPr>
               <w:t>date_h</w:t>
             </w:r>
@@ -942,8 +972,8 @@
               <w:rPr>
                 <w:rFonts w:ascii="Consolas" w:hAnsi="Consolas"/>
                 <w:color w:val="FFFFFF" w:themeColor="background1"/>
-                <w:sz w:val="24"/>
-                <w:szCs w:val="24"/>
+                <w:sz w:val="28"/>
+                <w:szCs w:val="28"/>
               </w:rPr>
               <w:t>}}</w:t>
             </w:r>
@@ -951,8 +981,8 @@
               <w:rPr>
                 <w:color w:val="FFFFFF" w:themeColor="background1"/>
                 <w:w w:val="97"/>
-                <w:sz w:val="24"/>
-                <w:szCs w:val="24"/>
+                <w:sz w:val="28"/>
+                <w:szCs w:val="28"/>
               </w:rPr>
               <w:t>)</w:t>
             </w:r>
@@ -960,8 +990,8 @@
               <w:rPr>
                 <w:color w:val="FFFFFF" w:themeColor="background1"/>
                 <w:spacing w:val="29"/>
-                <w:sz w:val="24"/>
-                <w:szCs w:val="24"/>
+                <w:sz w:val="28"/>
+                <w:szCs w:val="28"/>
                 <w:rtl/>
               </w:rPr>
               <w:t xml:space="preserve"> </w:t>
@@ -971,8 +1001,8 @@
               <w:rPr>
                 <w:color w:val="FFFFFF" w:themeColor="background1"/>
                 <w:w w:val="97"/>
-                <w:sz w:val="24"/>
-                <w:szCs w:val="24"/>
+                <w:sz w:val="28"/>
+                <w:szCs w:val="28"/>
                 <w:rtl/>
               </w:rPr>
               <w:t>اﻟﻰ</w:t>
@@ -982,8 +1012,8 @@
               <w:rPr>
                 <w:color w:val="FFFFFF" w:themeColor="background1"/>
                 <w:w w:val="97"/>
-                <w:sz w:val="24"/>
-                <w:szCs w:val="24"/>
+                <w:sz w:val="28"/>
+                <w:szCs w:val="28"/>
               </w:rPr>
               <w:t>(</w:t>
             </w:r>
@@ -991,8 +1021,8 @@
               <w:rPr>
                 <w:rFonts w:ascii="Consolas" w:hAnsi="Consolas"/>
                 <w:color w:val="FFFFFF" w:themeColor="background1"/>
-                <w:sz w:val="24"/>
-                <w:szCs w:val="24"/>
+                <w:sz w:val="28"/>
+                <w:szCs w:val="28"/>
               </w:rPr>
               <w:t>{{</w:t>
             </w:r>
@@ -1001,8 +1031,8 @@
               <w:rPr>
                 <w:rFonts w:ascii="Consolas" w:hAnsi="Consolas"/>
                 <w:color w:val="FFFFFF" w:themeColor="background1"/>
-                <w:sz w:val="24"/>
-                <w:szCs w:val="24"/>
+                <w:sz w:val="28"/>
+                <w:szCs w:val="28"/>
               </w:rPr>
               <w:t>date_h</w:t>
             </w:r>
@@ -1011,8 +1041,8 @@
               <w:rPr>
                 <w:rFonts w:ascii="Consolas" w:hAnsi="Consolas"/>
                 <w:color w:val="FFFFFF" w:themeColor="background1"/>
-                <w:sz w:val="24"/>
-                <w:szCs w:val="24"/>
+                <w:sz w:val="28"/>
+                <w:szCs w:val="28"/>
               </w:rPr>
               <w:t>}}</w:t>
             </w:r>
@@ -1020,8 +1050,8 @@
               <w:rPr>
                 <w:color w:val="FFFFFF" w:themeColor="background1"/>
                 <w:w w:val="97"/>
-                <w:sz w:val="24"/>
-                <w:szCs w:val="24"/>
+                <w:sz w:val="28"/>
+                <w:szCs w:val="28"/>
               </w:rPr>
               <w:t>)</w:t>
             </w:r>
@@ -1032,7 +1062,6 @@
               <w:bidi/>
               <w:ind w:left="1175"/>
               <w:rPr>
-                <w:rFonts w:hint="cs"/>
                 <w:color w:val="FFFFFF" w:themeColor="background1"/>
                 <w:sz w:val="24"/>
                 <w:szCs w:val="24"/>
@@ -1198,38 +1227,38 @@
               <w:spacing w:line="330" w:lineRule="atLeast"/>
               <w:jc w:val="center"/>
               <w:rPr>
-                <w:rFonts w:ascii="Consolas" w:hAnsi="Consolas"/>
+                <w:rFonts w:ascii="Tahoma" w:hAnsi="Tahoma" w:cs="Tahoma"/>
                 <w:color w:val="1F497D" w:themeColor="text2"/>
-                <w:sz w:val="28"/>
-                <w:szCs w:val="28"/>
-              </w:rPr>
-            </w:pPr>
-            <w:r>
-              <w:rPr>
-                <w:rFonts w:ascii="Consolas" w:hAnsi="Consolas"/>
+                <w:sz w:val="30"/>
+                <w:szCs w:val="30"/>
+              </w:rPr>
+            </w:pPr>
+            <w:r>
+              <w:rPr>
+                <w:rFonts w:ascii="Tahoma" w:hAnsi="Tahoma" w:cs="Tahoma"/>
                 <w:color w:val="1F497D" w:themeColor="text2"/>
-                <w:sz w:val="28"/>
-                <w:szCs w:val="28"/>
+                <w:sz w:val="30"/>
+                <w:szCs w:val="30"/>
               </w:rPr>
               <w:t>{{</w:t>
             </w:r>
             <w:proofErr w:type="spellStart"/>
             <w:r>
               <w:rPr>
-                <w:rFonts w:ascii="Consolas" w:hAnsi="Consolas"/>
+                <w:rFonts w:ascii="Tahoma" w:hAnsi="Tahoma" w:cs="Tahoma"/>
                 <w:color w:val="1F497D" w:themeColor="text2"/>
-                <w:sz w:val="28"/>
-                <w:szCs w:val="28"/>
+                <w:sz w:val="30"/>
+                <w:szCs w:val="30"/>
               </w:rPr>
               <w:t>date_g</w:t>
             </w:r>
             <w:proofErr w:type="spellEnd"/>
             <w:r>
               <w:rPr>
-                <w:rFonts w:ascii="Consolas" w:hAnsi="Consolas"/>
+                <w:rFonts w:ascii="Tahoma" w:hAnsi="Tahoma" w:cs="Tahoma"/>
                 <w:color w:val="1F497D" w:themeColor="text2"/>
-                <w:sz w:val="28"/>
-                <w:szCs w:val="28"/>
+                <w:sz w:val="30"/>
+                <w:szCs w:val="30"/>
               </w:rPr>
               <w:t>}}</w:t>
             </w:r>
@@ -1272,38 +1301,38 @@
               <w:spacing w:line="330" w:lineRule="atLeast"/>
               <w:jc w:val="center"/>
               <w:rPr>
-                <w:rFonts w:ascii="Consolas" w:hAnsi="Consolas"/>
-                <w:color w:val="0F1115"/>
-                <w:sz w:val="24"/>
-                <w:szCs w:val="24"/>
-              </w:rPr>
-            </w:pPr>
-            <w:r>
-              <w:rPr>
-                <w:rFonts w:ascii="Consolas" w:hAnsi="Consolas"/>
-                <w:color w:val="0F1115"/>
-                <w:sz w:val="24"/>
-                <w:szCs w:val="24"/>
+                <w:rFonts w:ascii="Tahoma" w:hAnsi="Tahoma" w:cs="Tahoma"/>
+                <w:color w:val="1F497D" w:themeColor="text2"/>
+                <w:sz w:val="30"/>
+                <w:szCs w:val="30"/>
+              </w:rPr>
+            </w:pPr>
+            <w:r>
+              <w:rPr>
+                <w:rFonts w:ascii="Tahoma" w:hAnsi="Tahoma" w:cs="Tahoma"/>
+                <w:color w:val="1F497D" w:themeColor="text2"/>
+                <w:sz w:val="30"/>
+                <w:szCs w:val="30"/>
               </w:rPr>
               <w:t>{{</w:t>
             </w:r>
             <w:proofErr w:type="spellStart"/>
             <w:r>
               <w:rPr>
-                <w:rFonts w:ascii="Consolas" w:hAnsi="Consolas"/>
-                <w:color w:val="0F1115"/>
-                <w:sz w:val="24"/>
-                <w:szCs w:val="24"/>
+                <w:rFonts w:ascii="Tahoma" w:hAnsi="Tahoma" w:cs="Tahoma"/>
+                <w:color w:val="1F497D" w:themeColor="text2"/>
+                <w:sz w:val="30"/>
+                <w:szCs w:val="30"/>
               </w:rPr>
               <w:t>date_h</w:t>
             </w:r>
             <w:proofErr w:type="spellEnd"/>
             <w:r>
               <w:rPr>
-                <w:rFonts w:ascii="Consolas" w:hAnsi="Consolas"/>
-                <w:color w:val="0F1115"/>
-                <w:sz w:val="24"/>
-                <w:szCs w:val="24"/>
+                <w:rFonts w:ascii="Tahoma" w:hAnsi="Tahoma" w:cs="Tahoma"/>
+                <w:color w:val="1F497D" w:themeColor="text2"/>
+                <w:sz w:val="30"/>
+                <w:szCs w:val="30"/>
               </w:rPr>
               <w:t>}}</w:t>
             </w:r>
@@ -1478,38 +1507,38 @@
               <w:spacing w:line="330" w:lineRule="atLeast"/>
               <w:jc w:val="center"/>
               <w:rPr>
-                <w:rFonts w:ascii="Consolas" w:hAnsi="Consolas"/>
+                <w:rFonts w:ascii="Tahoma" w:hAnsi="Tahoma" w:cs="Tahoma"/>
                 <w:color w:val="1F497D" w:themeColor="text2"/>
-                <w:sz w:val="28"/>
-                <w:szCs w:val="28"/>
-              </w:rPr>
-            </w:pPr>
-            <w:r>
-              <w:rPr>
-                <w:rFonts w:ascii="Consolas" w:hAnsi="Consolas"/>
+                <w:sz w:val="30"/>
+                <w:szCs w:val="30"/>
+              </w:rPr>
+            </w:pPr>
+            <w:r>
+              <w:rPr>
+                <w:rFonts w:ascii="Tahoma" w:hAnsi="Tahoma" w:cs="Tahoma"/>
                 <w:color w:val="1F497D" w:themeColor="text2"/>
-                <w:sz w:val="28"/>
-                <w:szCs w:val="28"/>
+                <w:sz w:val="30"/>
+                <w:szCs w:val="30"/>
               </w:rPr>
               <w:t>{{</w:t>
             </w:r>
             <w:proofErr w:type="spellStart"/>
             <w:r>
               <w:rPr>
-                <w:rFonts w:ascii="Consolas" w:hAnsi="Consolas"/>
+                <w:rFonts w:ascii="Tahoma" w:hAnsi="Tahoma" w:cs="Tahoma"/>
                 <w:color w:val="1F497D" w:themeColor="text2"/>
-                <w:sz w:val="28"/>
-                <w:szCs w:val="28"/>
+                <w:sz w:val="30"/>
+                <w:szCs w:val="30"/>
               </w:rPr>
               <w:t>date_g</w:t>
             </w:r>
             <w:proofErr w:type="spellEnd"/>
             <w:r>
               <w:rPr>
-                <w:rFonts w:ascii="Consolas" w:hAnsi="Consolas"/>
+                <w:rFonts w:ascii="Tahoma" w:hAnsi="Tahoma" w:cs="Tahoma"/>
                 <w:color w:val="1F497D" w:themeColor="text2"/>
-                <w:sz w:val="28"/>
-                <w:szCs w:val="28"/>
+                <w:sz w:val="30"/>
+                <w:szCs w:val="30"/>
               </w:rPr>
               <w:t>}}</w:t>
             </w:r>
@@ -1549,38 +1578,38 @@
               <w:spacing w:line="330" w:lineRule="atLeast"/>
               <w:jc w:val="center"/>
               <w:rPr>
-                <w:rFonts w:ascii="Consolas" w:hAnsi="Consolas"/>
-                <w:color w:val="0F1115"/>
-                <w:sz w:val="24"/>
-                <w:szCs w:val="24"/>
-              </w:rPr>
-            </w:pPr>
-            <w:r>
-              <w:rPr>
-                <w:rFonts w:ascii="Consolas" w:hAnsi="Consolas"/>
-                <w:color w:val="0F1115"/>
-                <w:sz w:val="24"/>
-                <w:szCs w:val="24"/>
+                <w:rFonts w:ascii="Tahoma" w:hAnsi="Tahoma" w:cs="Tahoma"/>
+                <w:color w:val="1F497D" w:themeColor="text2"/>
+                <w:sz w:val="30"/>
+                <w:szCs w:val="30"/>
+              </w:rPr>
+            </w:pPr>
+            <w:r>
+              <w:rPr>
+                <w:rFonts w:ascii="Tahoma" w:hAnsi="Tahoma" w:cs="Tahoma"/>
+                <w:color w:val="1F497D" w:themeColor="text2"/>
+                <w:sz w:val="30"/>
+                <w:szCs w:val="30"/>
               </w:rPr>
               <w:t>{{</w:t>
             </w:r>
             <w:proofErr w:type="spellStart"/>
             <w:r>
               <w:rPr>
-                <w:rFonts w:ascii="Consolas" w:hAnsi="Consolas"/>
-                <w:color w:val="0F1115"/>
-                <w:sz w:val="24"/>
-                <w:szCs w:val="24"/>
+                <w:rFonts w:ascii="Tahoma" w:hAnsi="Tahoma" w:cs="Tahoma"/>
+                <w:color w:val="1F497D" w:themeColor="text2"/>
+                <w:sz w:val="30"/>
+                <w:szCs w:val="30"/>
               </w:rPr>
               <w:t>date_h</w:t>
             </w:r>
             <w:proofErr w:type="spellEnd"/>
             <w:r>
               <w:rPr>
-                <w:rFonts w:ascii="Consolas" w:hAnsi="Consolas"/>
-                <w:color w:val="0F1115"/>
-                <w:sz w:val="24"/>
-                <w:szCs w:val="24"/>
+                <w:rFonts w:ascii="Tahoma" w:hAnsi="Tahoma" w:cs="Tahoma"/>
+                <w:color w:val="1F497D" w:themeColor="text2"/>
+                <w:sz w:val="30"/>
+                <w:szCs w:val="30"/>
               </w:rPr>
               <w:t>}}</w:t>
             </w:r>
@@ -1751,38 +1780,38 @@
               <w:spacing w:line="330" w:lineRule="atLeast"/>
               <w:jc w:val="center"/>
               <w:rPr>
-                <w:rFonts w:ascii="Consolas" w:hAnsi="Consolas"/>
+                <w:rFonts w:ascii="Tahoma" w:hAnsi="Tahoma" w:cs="Tahoma"/>
                 <w:color w:val="1F497D" w:themeColor="text2"/>
-                <w:sz w:val="28"/>
-                <w:szCs w:val="28"/>
-              </w:rPr>
-            </w:pPr>
-            <w:r>
-              <w:rPr>
-                <w:rFonts w:ascii="Consolas" w:hAnsi="Consolas"/>
+                <w:sz w:val="30"/>
+                <w:szCs w:val="30"/>
+              </w:rPr>
+            </w:pPr>
+            <w:r>
+              <w:rPr>
+                <w:rFonts w:ascii="Tahoma" w:hAnsi="Tahoma" w:cs="Tahoma"/>
                 <w:color w:val="1F497D" w:themeColor="text2"/>
-                <w:sz w:val="28"/>
-                <w:szCs w:val="28"/>
+                <w:sz w:val="30"/>
+                <w:szCs w:val="30"/>
               </w:rPr>
               <w:t>{{</w:t>
             </w:r>
             <w:proofErr w:type="spellStart"/>
             <w:r>
               <w:rPr>
-                <w:rFonts w:ascii="Consolas" w:hAnsi="Consolas"/>
+                <w:rFonts w:ascii="Tahoma" w:hAnsi="Tahoma" w:cs="Tahoma"/>
                 <w:color w:val="1F497D" w:themeColor="text2"/>
-                <w:sz w:val="28"/>
-                <w:szCs w:val="28"/>
+                <w:sz w:val="30"/>
+                <w:szCs w:val="30"/>
               </w:rPr>
               <w:t>date_g</w:t>
             </w:r>
             <w:proofErr w:type="spellEnd"/>
             <w:r>
               <w:rPr>
-                <w:rFonts w:ascii="Consolas" w:hAnsi="Consolas"/>
+                <w:rFonts w:ascii="Tahoma" w:hAnsi="Tahoma" w:cs="Tahoma"/>
                 <w:color w:val="1F497D" w:themeColor="text2"/>
-                <w:sz w:val="28"/>
-                <w:szCs w:val="28"/>
+                <w:sz w:val="30"/>
+                <w:szCs w:val="30"/>
               </w:rPr>
               <w:t>}}</w:t>
             </w:r>
@@ -1978,38 +2007,38 @@
               <w:spacing w:line="330" w:lineRule="atLeast"/>
               <w:jc w:val="center"/>
               <w:rPr>
-                <w:rFonts w:ascii="Consolas" w:hAnsi="Consolas"/>
-                <w:color w:val="0F1115"/>
-                <w:sz w:val="24"/>
-                <w:szCs w:val="24"/>
-              </w:rPr>
-            </w:pPr>
-            <w:r>
-              <w:rPr>
-                <w:rFonts w:ascii="Consolas" w:hAnsi="Consolas"/>
-                <w:color w:val="0F1115"/>
-                <w:sz w:val="24"/>
-                <w:szCs w:val="24"/>
+                <w:rFonts w:ascii="Tahoma" w:hAnsi="Tahoma" w:cs="Tahoma"/>
+                <w:color w:val="1F497D" w:themeColor="text2"/>
+                <w:sz w:val="30"/>
+                <w:szCs w:val="30"/>
+              </w:rPr>
+            </w:pPr>
+            <w:r>
+              <w:rPr>
+                <w:rFonts w:ascii="Tahoma" w:hAnsi="Tahoma" w:cs="Tahoma"/>
+                <w:color w:val="1F497D" w:themeColor="text2"/>
+                <w:sz w:val="30"/>
+                <w:szCs w:val="30"/>
               </w:rPr>
               <w:t>{{</w:t>
             </w:r>
             <w:proofErr w:type="spellStart"/>
             <w:r>
               <w:rPr>
-                <w:rFonts w:ascii="Consolas" w:hAnsi="Consolas"/>
-                <w:color w:val="0F1115"/>
-                <w:sz w:val="24"/>
-                <w:szCs w:val="24"/>
+                <w:rFonts w:ascii="Tahoma" w:hAnsi="Tahoma" w:cs="Tahoma"/>
+                <w:color w:val="1F497D" w:themeColor="text2"/>
+                <w:sz w:val="30"/>
+                <w:szCs w:val="30"/>
               </w:rPr>
               <w:t>name_en</w:t>
             </w:r>
             <w:proofErr w:type="spellEnd"/>
             <w:r>
               <w:rPr>
-                <w:rFonts w:ascii="Consolas" w:hAnsi="Consolas"/>
-                <w:color w:val="0F1115"/>
-                <w:sz w:val="24"/>
-                <w:szCs w:val="24"/>
+                <w:rFonts w:ascii="Tahoma" w:hAnsi="Tahoma" w:cs="Tahoma"/>
+                <w:color w:val="1F497D" w:themeColor="text2"/>
+                <w:sz w:val="30"/>
+                <w:szCs w:val="30"/>
               </w:rPr>
               <w:t>}}</w:t>
             </w:r>
@@ -2066,38 +2095,38 @@
               <w:spacing w:line="330" w:lineRule="atLeast"/>
               <w:jc w:val="center"/>
               <w:rPr>
-                <w:rFonts w:ascii="Consolas" w:eastAsia="Times New Roman" w:hAnsi="Consolas" w:cs="Courier New"/>
-                <w:color w:val="0F1115"/>
-                <w:sz w:val="28"/>
-                <w:szCs w:val="28"/>
-              </w:rPr>
-            </w:pPr>
-            <w:r>
-              <w:rPr>
-                <w:rFonts w:ascii="Consolas" w:eastAsia="Times New Roman" w:hAnsi="Consolas" w:cs="Courier New"/>
-                <w:color w:val="0F1115"/>
-                <w:sz w:val="28"/>
-                <w:szCs w:val="28"/>
+                <w:rFonts w:eastAsia="Times New Roman"/>
+                <w:color w:val="1F497D" w:themeColor="text2"/>
+                <w:sz w:val="30"/>
+                <w:szCs w:val="30"/>
+              </w:rPr>
+            </w:pPr>
+            <w:r>
+              <w:rPr>
+                <w:rFonts w:eastAsia="Times New Roman"/>
+                <w:color w:val="1F497D" w:themeColor="text2"/>
+                <w:sz w:val="30"/>
+                <w:szCs w:val="30"/>
               </w:rPr>
               <w:t>{{</w:t>
             </w:r>
             <w:proofErr w:type="spellStart"/>
             <w:r>
               <w:rPr>
-                <w:rFonts w:ascii="Consolas" w:eastAsia="Times New Roman" w:hAnsi="Consolas" w:cs="Courier New"/>
-                <w:color w:val="0F1115"/>
-                <w:sz w:val="28"/>
-                <w:szCs w:val="28"/>
+                <w:rFonts w:eastAsia="Times New Roman"/>
+                <w:color w:val="1F497D" w:themeColor="text2"/>
+                <w:sz w:val="30"/>
+                <w:szCs w:val="30"/>
               </w:rPr>
               <w:t>name_ar</w:t>
             </w:r>
             <w:proofErr w:type="spellEnd"/>
             <w:r>
               <w:rPr>
-                <w:rFonts w:ascii="Consolas" w:eastAsia="Times New Roman" w:hAnsi="Consolas" w:cs="Courier New"/>
-                <w:color w:val="0F1115"/>
-                <w:sz w:val="28"/>
-                <w:szCs w:val="28"/>
+                <w:rFonts w:eastAsia="Times New Roman"/>
+                <w:color w:val="1F497D" w:themeColor="text2"/>
+                <w:sz w:val="30"/>
+                <w:szCs w:val="30"/>
               </w:rPr>
               <w:t>}}</w:t>
             </w:r>
@@ -2266,7 +2295,7 @@
               <w:jc w:val="center"/>
               <w:rPr>
                 <w:rFonts w:ascii="Consolas" w:hAnsi="Consolas"/>
-                <w:color w:val="0F1115"/>
+                <w:color w:val="1F497D" w:themeColor="text2"/>
                 <w:sz w:val="28"/>
                 <w:szCs w:val="28"/>
               </w:rPr>
@@ -2274,9 +2303,9 @@
             <w:r>
               <w:rPr>
                 <w:rFonts w:ascii="Consolas" w:hAnsi="Consolas"/>
-                <w:color w:val="0F1115"/>
-                <w:sz w:val="28"/>
-                <w:szCs w:val="28"/>
+                <w:color w:val="1F497D" w:themeColor="text2"/>
+                <w:sz w:val="32"/>
+                <w:szCs w:val="32"/>
               </w:rPr>
               <w:t>{{</w:t>
             </w:r>
@@ -2284,9 +2313,9 @@
             <w:r>
               <w:rPr>
                 <w:rFonts w:ascii="Consolas" w:hAnsi="Consolas"/>
-                <w:color w:val="0F1115"/>
-                <w:sz w:val="28"/>
-                <w:szCs w:val="28"/>
+                <w:color w:val="1F497D" w:themeColor="text2"/>
+                <w:sz w:val="32"/>
+                <w:szCs w:val="32"/>
               </w:rPr>
               <w:t>national_id</w:t>
             </w:r>
@@ -2294,9 +2323,9 @@
             <w:r>
               <w:rPr>
                 <w:rFonts w:ascii="Consolas" w:hAnsi="Consolas"/>
-                <w:color w:val="0F1115"/>
-                <w:sz w:val="28"/>
-                <w:szCs w:val="28"/>
+                <w:color w:val="1F497D" w:themeColor="text2"/>
+                <w:sz w:val="32"/>
+                <w:szCs w:val="32"/>
               </w:rPr>
               <w:t>}}</w:t>
             </w:r>
@@ -2479,34 +2508,6 @@
                 <w:sz w:val="31"/>
               </w:rPr>
             </w:pPr>
-            <w:proofErr w:type="spellStart"/>
-            <w:r>
-              <w:rPr>
-                <w:color w:val="293B78"/>
-                <w:spacing w:val="-13"/>
-                <w:sz w:val="31"/>
-              </w:rPr>
-              <w:t>Ibtihaj</w:t>
-            </w:r>
-            <w:proofErr w:type="spellEnd"/>
-            <w:r>
-              <w:rPr>
-                <w:color w:val="293B78"/>
-                <w:spacing w:val="-13"/>
-                <w:sz w:val="31"/>
-              </w:rPr>
-              <w:t xml:space="preserve">  </w:t>
-            </w:r>
-            <w:proofErr w:type="spellStart"/>
-            <w:r>
-              <w:rPr>
-                <w:color w:val="293B78"/>
-                <w:spacing w:val="-2"/>
-                <w:sz w:val="31"/>
-              </w:rPr>
-              <w:t>Ayed</w:t>
-            </w:r>
-            <w:proofErr w:type="spellEnd"/>
           </w:p>
         </w:tc>
         <w:tc>
@@ -2884,38 +2885,38 @@
               <w:spacing w:line="330" w:lineRule="atLeast"/>
               <w:jc w:val="center"/>
               <w:rPr>
-                <w:rFonts w:ascii="Consolas" w:hAnsi="Consolas"/>
-                <w:color w:val="0F1115"/>
-                <w:sz w:val="24"/>
-                <w:szCs w:val="24"/>
-              </w:rPr>
-            </w:pPr>
-            <w:r>
-              <w:rPr>
-                <w:rFonts w:ascii="Consolas" w:hAnsi="Consolas"/>
-                <w:color w:val="0F1115"/>
-                <w:sz w:val="24"/>
-                <w:szCs w:val="24"/>
+                <w:rFonts w:ascii="Tahoma" w:hAnsi="Tahoma" w:cs="Tahoma"/>
+                <w:color w:val="1F497D" w:themeColor="text2"/>
+                <w:sz w:val="30"/>
+                <w:szCs w:val="30"/>
+              </w:rPr>
+            </w:pPr>
+            <w:r>
+              <w:rPr>
+                <w:rFonts w:ascii="Tahoma" w:hAnsi="Tahoma" w:cs="Tahoma"/>
+                <w:color w:val="1F497D" w:themeColor="text2"/>
+                <w:sz w:val="30"/>
+                <w:szCs w:val="30"/>
               </w:rPr>
               <w:t>{{</w:t>
             </w:r>
             <w:proofErr w:type="spellStart"/>
             <w:r>
               <w:rPr>
-                <w:rFonts w:ascii="Consolas" w:hAnsi="Consolas"/>
-                <w:color w:val="0F1115"/>
-                <w:sz w:val="24"/>
-                <w:szCs w:val="24"/>
+                <w:rFonts w:ascii="Tahoma" w:hAnsi="Tahoma" w:cs="Tahoma"/>
+                <w:color w:val="1F497D" w:themeColor="text2"/>
+                <w:sz w:val="30"/>
+                <w:szCs w:val="30"/>
               </w:rPr>
               <w:t>doctor_en</w:t>
             </w:r>
             <w:proofErr w:type="spellEnd"/>
             <w:r>
               <w:rPr>
-                <w:rFonts w:ascii="Consolas" w:hAnsi="Consolas"/>
-                <w:color w:val="0F1115"/>
-                <w:sz w:val="24"/>
-                <w:szCs w:val="24"/>
+                <w:rFonts w:ascii="Tahoma" w:hAnsi="Tahoma" w:cs="Tahoma"/>
+                <w:color w:val="1F497D" w:themeColor="text2"/>
+                <w:sz w:val="30"/>
+                <w:szCs w:val="30"/>
               </w:rPr>
               <w:t>}}</w:t>
             </w:r>
@@ -2956,38 +2957,38 @@
               <w:spacing w:line="330" w:lineRule="atLeast"/>
               <w:jc w:val="center"/>
               <w:rPr>
-                <w:rFonts w:ascii="Consolas" w:hAnsi="Consolas"/>
-                <w:color w:val="0F1115"/>
-                <w:sz w:val="28"/>
-                <w:szCs w:val="28"/>
-              </w:rPr>
-            </w:pPr>
-            <w:r>
-              <w:rPr>
-                <w:rFonts w:ascii="Consolas" w:hAnsi="Consolas"/>
-                <w:color w:val="0F1115"/>
-                <w:sz w:val="28"/>
-                <w:szCs w:val="28"/>
+                <w:rFonts w:ascii="Tahoma" w:hAnsi="Tahoma" w:cs="Tahoma"/>
+                <w:color w:val="1F497D" w:themeColor="text2"/>
+                <w:sz w:val="30"/>
+                <w:szCs w:val="30"/>
+              </w:rPr>
+            </w:pPr>
+            <w:r>
+              <w:rPr>
+                <w:rFonts w:ascii="Tahoma" w:hAnsi="Tahoma" w:cs="Tahoma"/>
+                <w:color w:val="1F497D" w:themeColor="text2"/>
+                <w:sz w:val="30"/>
+                <w:szCs w:val="30"/>
               </w:rPr>
               <w:t>{{</w:t>
             </w:r>
             <w:proofErr w:type="spellStart"/>
             <w:r>
               <w:rPr>
-                <w:rFonts w:ascii="Consolas" w:hAnsi="Consolas"/>
-                <w:color w:val="0F1115"/>
-                <w:sz w:val="28"/>
-                <w:szCs w:val="28"/>
+                <w:rFonts w:ascii="Tahoma" w:hAnsi="Tahoma" w:cs="Tahoma"/>
+                <w:color w:val="1F497D" w:themeColor="text2"/>
+                <w:sz w:val="30"/>
+                <w:szCs w:val="30"/>
               </w:rPr>
               <w:t>doctor_ar</w:t>
             </w:r>
             <w:proofErr w:type="spellEnd"/>
             <w:r>
               <w:rPr>
-                <w:rFonts w:ascii="Consolas" w:hAnsi="Consolas"/>
-                <w:color w:val="0F1115"/>
-                <w:sz w:val="28"/>
-                <w:szCs w:val="28"/>
+                <w:rFonts w:ascii="Tahoma" w:hAnsi="Tahoma" w:cs="Tahoma"/>
+                <w:color w:val="1F497D" w:themeColor="text2"/>
+                <w:sz w:val="30"/>
+                <w:szCs w:val="30"/>
               </w:rPr>
               <w:t>}}</w:t>
             </w:r>
@@ -2999,7 +3000,6 @@
               <w:ind w:left="1346"/>
               <w:jc w:val="center"/>
               <w:rPr>
-                <w:rFonts w:hint="cs"/>
                 <w:sz w:val="28"/>
                 <w:szCs w:val="28"/>
               </w:rPr>
@@ -3626,35 +3626,6 @@
           <w:sz w:val="20"/>
         </w:rPr>
       </w:pPr>
-    </w:p>
-    <w:p>
-      <w:pPr>
-        <w:spacing w:before="46"/>
-        <w:rPr>
-          <w:b/>
-          <w:sz w:val="20"/>
-        </w:rPr>
-      </w:pPr>
-    </w:p>
-    <w:p>
-      <w:pPr>
-        <w:pStyle w:val="a3"/>
-        <w:bidi/>
-        <w:ind w:left="12727"/>
-        <w:rPr>
-          <w:w w:val="97"/>
-        </w:rPr>
-      </w:pPr>
-    </w:p>
-    <w:p>
-      <w:pPr>
-        <w:pStyle w:val="a3"/>
-        <w:bidi/>
-        <w:ind w:left="12727"/>
-        <w:rPr>
-          <w:w w:val="97"/>
-        </w:rPr>
-      </w:pPr>
       <w:r>
         <w:rPr>
           <w:noProof/>
@@ -3662,13 +3633,13 @@
         <mc:AlternateContent>
           <mc:Choice Requires="wps">
             <w:drawing>
-              <wp:anchor distT="0" distB="0" distL="114300" distR="114300" simplePos="0" relativeHeight="251661824" behindDoc="0" locked="0" layoutInCell="1" allowOverlap="1" wp14:anchorId="109D0B59" wp14:editId="4C2A6A9C">
+              <wp:anchor distT="0" distB="0" distL="114300" distR="114300" simplePos="0" relativeHeight="251658240" behindDoc="0" locked="0" layoutInCell="1" allowOverlap="1" wp14:anchorId="109D0B59" wp14:editId="2DDF6098">
                 <wp:simplePos x="0" y="0"/>
                 <wp:positionH relativeFrom="column">
-                  <wp:posOffset>7292975</wp:posOffset>
+                  <wp:posOffset>7381875</wp:posOffset>
                 </wp:positionH>
                 <wp:positionV relativeFrom="paragraph">
-                  <wp:posOffset>34925</wp:posOffset>
+                  <wp:posOffset>121285</wp:posOffset>
                 </wp:positionV>
                 <wp:extent cx="2546350" cy="2044700"/>
                 <wp:effectExtent l="0" t="0" r="6350" b="0"/>
@@ -3766,7 +3737,7 @@
           </mc:Choice>
           <mc:Fallback>
             <w:pict>
-              <v:shape w14:anchorId="109D0B59" id="مربع نص 7" o:spid="_x0000_s1027" type="#_x0000_t202" style="position:absolute;left:0;text-align:left;margin-left:574.25pt;margin-top:2.75pt;width:200.5pt;height:161pt;z-index:251661824;visibility:visible;mso-wrap-style:square;mso-width-percent:0;mso-height-percent:0;mso-wrap-distance-left:9pt;mso-wrap-distance-top:0;mso-wrap-distance-right:9pt;mso-wrap-distance-bottom:0;mso-position-horizontal:absolute;mso-position-horizontal-relative:text;mso-position-vertical:absolute;mso-position-vertical-relative:text;mso-width-percent:0;mso-height-percent:0;mso-width-relative:margin;mso-height-relative:margin;v-text-anchor:top" o:gfxdata="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" fillcolor="white [3201]" stroked="f" strokeweight=".5pt">
+              <v:shape w14:anchorId="109D0B59" id="مربع نص 7" o:spid="_x0000_s1027" type="#_x0000_t202" style="position:absolute;margin-left:581.25pt;margin-top:9.55pt;width:200.5pt;height:161pt;z-index:251658240;visibility:visible;mso-wrap-style:square;mso-width-percent:0;mso-height-percent:0;mso-wrap-distance-left:9pt;mso-wrap-distance-top:0;mso-wrap-distance-right:9pt;mso-wrap-distance-bottom:0;mso-position-horizontal:absolute;mso-position-horizontal-relative:text;mso-position-vertical:absolute;mso-position-vertical-relative:text;mso-width-percent:0;mso-height-percent:0;mso-width-relative:margin;mso-height-relative:margin;v-text-anchor:top" o:gfxdata="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" fillcolor="white [3201]" stroked="f" strokeweight=".5pt">
                 <v:textbox>
                   <w:txbxContent>
                     <w:p>
@@ -3827,6 +3798,35 @@
     </w:p>
     <w:p>
       <w:pPr>
+        <w:spacing w:before="46"/>
+        <w:rPr>
+          <w:b/>
+          <w:sz w:val="20"/>
+        </w:rPr>
+      </w:pPr>
+    </w:p>
+    <w:p>
+      <w:pPr>
+        <w:pStyle w:val="a3"/>
+        <w:bidi/>
+        <w:ind w:left="12727"/>
+        <w:rPr>
+          <w:w w:val="97"/>
+        </w:rPr>
+      </w:pPr>
+    </w:p>
+    <w:p>
+      <w:pPr>
+        <w:pStyle w:val="a3"/>
+        <w:bidi/>
+        <w:ind w:left="12727"/>
+        <w:rPr>
+          <w:w w:val="97"/>
+        </w:rPr>
+      </w:pPr>
+    </w:p>
+    <w:p>
+      <w:pPr>
         <w:pStyle w:val="a3"/>
         <w:bidi/>
         <w:ind w:left="12727"/>
@@ -4129,13 +4129,13 @@
         <mc:AlternateContent>
           <mc:Choice Requires="wps">
             <w:drawing>
-              <wp:anchor distT="0" distB="0" distL="114300" distR="114300" simplePos="0" relativeHeight="251662848" behindDoc="0" locked="0" layoutInCell="1" allowOverlap="1" wp14:anchorId="6B19AF3F" wp14:editId="73E950E2">
+              <wp:anchor distT="0" distB="0" distL="114300" distR="114300" simplePos="0" relativeHeight="251662848" behindDoc="0" locked="0" layoutInCell="1" allowOverlap="1" wp14:anchorId="6B19AF3F" wp14:editId="025EEB06">
                 <wp:simplePos x="0" y="0"/>
                 <wp:positionH relativeFrom="column">
                   <wp:posOffset>7968615</wp:posOffset>
                 </wp:positionH>
                 <wp:positionV relativeFrom="paragraph">
-                  <wp:posOffset>691515</wp:posOffset>
+                  <wp:posOffset>192405</wp:posOffset>
                 </wp:positionV>
                 <wp:extent cx="2011680" cy="350520"/>
                 <wp:effectExtent l="0" t="0" r="7620" b="0"/>
@@ -4181,18 +4181,18 @@
                               <w:spacing w:line="330" w:lineRule="atLeast"/>
                               <w:jc w:val="center"/>
                               <w:rPr>
-                                <w:rFonts w:ascii="Consolas" w:hAnsi="Consolas"/>
-                                <w:color w:val="0F1115"/>
-                                <w:sz w:val="28"/>
-                                <w:szCs w:val="28"/>
+                                <w:rFonts w:ascii="Tahoma" w:hAnsi="Tahoma" w:cs="Tahoma"/>
+                                <w:color w:val="1F497D" w:themeColor="text2"/>
+                                <w:sz w:val="32"/>
+                                <w:szCs w:val="32"/>
                               </w:rPr>
                             </w:pPr>
                             <w:r>
                               <w:rPr>
-                                <w:rFonts w:ascii="Consolas" w:hAnsi="Consolas"/>
-                                <w:color w:val="0F1115"/>
-                                <w:sz w:val="28"/>
-                                <w:szCs w:val="28"/>
+                                <w:rFonts w:ascii="Tahoma" w:hAnsi="Tahoma" w:cs="Tahoma"/>
+                                <w:color w:val="1F497D" w:themeColor="text2"/>
+                                <w:sz w:val="32"/>
+                                <w:szCs w:val="32"/>
                               </w:rPr>
                               <w:t>{{hospital}}</w:t>
                             </w:r>
@@ -4225,7 +4225,7 @@
           </mc:Choice>
           <mc:Fallback>
             <w:pict>
-              <v:rect w14:anchorId="6B19AF3F" id="مستطيل 9" o:spid="_x0000_s1028" style="position:absolute;left:0;text-align:left;margin-left:627.45pt;margin-top:54.45pt;width:158.4pt;height:27.6pt;z-index:251662848;visibility:visible;mso-wrap-style:square;mso-height-percent:0;mso-wrap-distance-left:9pt;mso-wrap-distance-top:0;mso-wrap-distance-right:9pt;mso-wrap-distance-bottom:0;mso-position-horizontal:absolute;mso-position-horizontal-relative:text;mso-position-vertical:absolute;mso-position-vertical-relative:text;mso-height-percent:0;mso-height-relative:margin;v-text-anchor:middle" o:gfxdata="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" fillcolor="white [3201]" stroked="f" strokeweight="2pt">
+              <v:rect w14:anchorId="6B19AF3F" id="مستطيل 9" o:spid="_x0000_s1028" style="position:absolute;left:0;text-align:left;margin-left:627.45pt;margin-top:15.15pt;width:158.4pt;height:27.6pt;z-index:251662848;visibility:visible;mso-wrap-style:square;mso-height-percent:0;mso-wrap-distance-left:9pt;mso-wrap-distance-top:0;mso-wrap-distance-right:9pt;mso-wrap-distance-bottom:0;mso-position-horizontal:absolute;mso-position-horizontal-relative:text;mso-position-vertical:absolute;mso-position-vertical-relative:text;mso-height-percent:0;mso-height-relative:margin;v-text-anchor:middle" o:gfxdata="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" fillcolor="white [3201]" stroked="f" strokeweight="2pt">
                 <v:textbox>
                   <w:txbxContent>
                     <w:p>
@@ -4235,18 +4235,18 @@
                         <w:spacing w:line="330" w:lineRule="atLeast"/>
                         <w:jc w:val="center"/>
                         <w:rPr>
-                          <w:rFonts w:ascii="Consolas" w:hAnsi="Consolas"/>
-                          <w:color w:val="0F1115"/>
-                          <w:sz w:val="28"/>
-                          <w:szCs w:val="28"/>
+                          <w:rFonts w:ascii="Tahoma" w:hAnsi="Tahoma" w:cs="Tahoma"/>
+                          <w:color w:val="1F497D" w:themeColor="text2"/>
+                          <w:sz w:val="32"/>
+                          <w:szCs w:val="32"/>
                         </w:rPr>
                       </w:pPr>
                       <w:r>
                         <w:rPr>
-                          <w:rFonts w:ascii="Consolas" w:hAnsi="Consolas"/>
-                          <w:color w:val="0F1115"/>
-                          <w:sz w:val="28"/>
-                          <w:szCs w:val="28"/>
+                          <w:rFonts w:ascii="Tahoma" w:hAnsi="Tahoma" w:cs="Tahoma"/>
+                          <w:color w:val="1F497D" w:themeColor="text2"/>
+                          <w:sz w:val="32"/>
+                          <w:szCs w:val="32"/>
                         </w:rPr>
                         <w:t>{{hospital}}</w:t>
                       </w:r>
@@ -4812,7 +4812,7 @@
         </mc:Choice>
         <mc:Fallback>
           <w:pict>
-            <v:group w14:anchorId="71C7AC42" id="Group 1" o:spid="_x0000_s1026" style="position:absolute;left:0;text-align:left;margin-left:650.5pt;margin-top:1412.6pt;width:107.25pt;height:73.5pt;z-index:-251661824;mso-wrap-distance-left:0;mso-wrap-distance-right:0;mso-position-horizontal-relative:page;mso-position-vertical-relative:page" coordsize="13620,9334" o:gfxdata="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">
+            <v:group w14:anchorId="781CC9EC" id="Group 1" o:spid="_x0000_s1026" style="position:absolute;left:0;text-align:left;margin-left:650.5pt;margin-top:1412.6pt;width:107.25pt;height:73.5pt;z-index:-251661824;mso-wrap-distance-left:0;mso-wrap-distance-right:0;mso-position-horizontal-relative:page;mso-position-vertical-relative:page" coordsize="13620,9334" o:gfxdata="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">
               <v:shapetype id="_x0000_t75" coordsize="21600,21600" o:spt="75" o:preferrelative="t" path="m@4@5l@4@11@9@11@9@5xe" filled="f" stroked="f">
                 <v:stroke joinstyle="miter"/>
                 <v:formulas>

</xml_diff>